<commit_message>
Replace gripper submission with name-only report and updated ZIP
</commit_message>
<xml_diff>
--- a/Industrial_Gripper_Design/report_editable.docx
+++ b/Industrial_Gripper_Design/report_editable.docx
@@ -23,11 +23,7 @@
     </w:p>
     <w:p>
       <w:r>
-        <w:t>Student: Deep Bisen   Roll No.: [Roll Number]</w:t>
-        <w:br/>
-        <w:t>College: [College Name]</w:t>
-        <w:br/>
-        <w:t>Branch / Semester: [Branch / Semester]</w:t>
+        <w:t>Student: Deep Bisen</w:t>
         <w:br/>
         <w:t>Date: 17 October 2026</w:t>
       </w:r>

</xml_diff>